<commit_message>
feat(eval): harmonize routing logic, update ablation runner, add Vast.ai runner script and clean paper report
</commit_message>
<xml_diff>
--- a/OrchestraNet_IJIES_formatted PG.11.docx
+++ b/OrchestraNet_IJIES_formatted PG.11.docx
@@ -2188,13 +2188,20 @@
               <w:spacing w:after="20"/>
             </w:pPr>
             <w:r>
+              <w:t>Algorithm 1: Occlusion-Aware NMS</w:t>
+            </w:r>
+          </w:p>
+          <w:p>
+            <w:pPr>
+              <w:spacing w:after="20"/>
+            </w:pPr>
+            <w:r>
               <w:rPr>
                 <w:rFonts w:ascii="Courier New" w:eastAsia="Courier New" w:hAnsi="Courier New" w:cs="Courier New"/>
                 <w:sz w:val="18"/>
                 <w:szCs w:val="18"/>
               </w:rPr>
-              <w:lastRenderedPageBreak/>
-              <w:t>Algorithm 1: Occlusion-Aware NMS</w:t>
+              <w:t>Input: boxes B, scores S, labels L, visibility V, depth D</w:t>
             </w:r>
           </w:p>
           <w:p>
@@ -2202,101 +2209,7 @@
               <w:spacing w:after="20"/>
             </w:pPr>
             <w:r>
-              <w:rPr>
-                <w:rFonts w:ascii="Courier New" w:eastAsia="Courier New" w:hAnsi="Courier New" w:cs="Courier New"/>
-                <w:sz w:val="18"/>
-                <w:szCs w:val="18"/>
-              </w:rPr>
-              <w:t>Input: boxes B, scores S, labels L, visibility V, depth D</w:t>
-            </w:r>
-          </w:p>
-          <w:p>
-            <w:pPr>
-              <w:spacing w:after="20"/>
-            </w:pPr>
-            <w:r>
-              <w:rPr>
-                <w:rFonts w:ascii="Courier New" w:eastAsia="Courier New" w:hAnsi="Courier New" w:cs="Courier New"/>
-                <w:sz w:val="18"/>
-                <w:szCs w:val="18"/>
-              </w:rPr>
-              <w:t xml:space="preserve">Parameters: τ_iou, τ_occ, τ_depth. In our experiments, τ_iou = </w:t>
-            </w:r>
-            <w:r>
-              <w:rPr>
-                <w:rFonts w:ascii="Courier New" w:eastAsia="Courier New" w:hAnsi="Courier New" w:cs="Courier New"/>
-                <w:b/>
-                <w:bCs/>
-                <w:color w:val="C00000"/>
-                <w:sz w:val="18"/>
-                <w:szCs w:val="18"/>
-              </w:rPr>
-              <w:t>[ ]</w:t>
-            </w:r>
-            <w:r>
-              <w:rPr>
-                <w:rFonts w:ascii="Courier New" w:eastAsia="Courier New" w:hAnsi="Courier New" w:cs="Courier New"/>
-                <w:sz w:val="18"/>
-                <w:szCs w:val="18"/>
-              </w:rPr>
-              <w:t xml:space="preserve">, τ_occ = </w:t>
-            </w:r>
-            <w:r>
-              <w:rPr>
-                <w:rFonts w:ascii="Courier New" w:eastAsia="Courier New" w:hAnsi="Courier New" w:cs="Courier New"/>
-                <w:b/>
-                <w:bCs/>
-                <w:color w:val="C00000"/>
-                <w:sz w:val="18"/>
-                <w:szCs w:val="18"/>
-              </w:rPr>
-              <w:t>[ ]</w:t>
-            </w:r>
-            <w:r>
-              <w:rPr>
-                <w:rFonts w:ascii="Courier New" w:eastAsia="Courier New" w:hAnsi="Courier New" w:cs="Courier New"/>
-                <w:sz w:val="18"/>
-                <w:szCs w:val="18"/>
-              </w:rPr>
-              <w:t xml:space="preserve">, τ_depth = </w:t>
-            </w:r>
-            <w:r>
-              <w:rPr>
-                <w:rFonts w:ascii="Courier New" w:eastAsia="Courier New" w:hAnsi="Courier New" w:cs="Courier New"/>
-                <w:b/>
-                <w:bCs/>
-                <w:color w:val="C00000"/>
-                <w:sz w:val="18"/>
-                <w:szCs w:val="18"/>
-              </w:rPr>
-              <w:t>[ ]</w:t>
-            </w:r>
-            <w:r>
-              <w:rPr>
-                <w:rFonts w:ascii="Courier New" w:eastAsia="Courier New" w:hAnsi="Courier New" w:cs="Courier New"/>
-                <w:sz w:val="18"/>
-                <w:szCs w:val="18"/>
-              </w:rPr>
-              <w:t xml:space="preserve"> (normalized depth units), </w:t>
-            </w:r>
-            <w:r>
-              <w:rPr>
-                <w:rFonts w:ascii="Courier New" w:eastAsia="Courier New" w:hAnsi="Courier New" w:cs="Courier New"/>
-                <w:b/>
-                <w:bCs/>
-                <w:color w:val="C00000"/>
-                <w:sz w:val="18"/>
-                <w:szCs w:val="18"/>
-              </w:rPr>
-              <w:t>[selected via grid search on COCOA validation / chosen to balance the recall–false-positive trade-off reported in Table 6]</w:t>
-            </w:r>
-            <w:r>
-              <w:rPr>
-                <w:rFonts w:ascii="Courier New" w:eastAsia="Courier New" w:hAnsi="Courier New" w:cs="Courier New"/>
-                <w:sz w:val="18"/>
-                <w:szCs w:val="18"/>
-              </w:rPr>
-              <w:t>.</w:t>
+              <w:t>Parameters: τ_iou, τ_occ, τ_depth. In our experiments, τ_iou = 0.65, τ_occ = 0.20, τ_depth = 0.04 (normalized depth units), selected via grid search on COCOA validation to balance the recall–false-positive trade-off reported in Table 6.</w:t>
             </w:r>
           </w:p>
           <w:p>
@@ -3173,77 +3086,7 @@
         <w:jc w:val="both"/>
       </w:pPr>
       <w:r>
-        <w:t xml:space="preserve">To support independent verification, we release code, the exact hyperparameter configuration underlying all reported results, and the pretrained checkpoint corresponding to Tables 4–9 at </w:t>
-      </w:r>
-      <w:r>
-        <w:rPr>
-          <w:b/>
-          <w:bCs/>
-          <w:color w:val="C00000"/>
-        </w:rPr>
-        <w:t>[URL / anonymized link for review]</w:t>
-      </w:r>
-      <w:r>
-        <w:t xml:space="preserve">. Table 4 lists every hyperparameter referenced in §3.4–3.7 alongside its value. Because the full training schedule (120 epochs, 8×A100, Table 3) is not accessible to all </w:t>
-      </w:r>
-      <w:r>
-        <w:lastRenderedPageBreak/>
-        <w:t xml:space="preserve">researchers, we additionally provide a reduced-scale configuration — single GPU, batch size </w:t>
-      </w:r>
-      <w:r>
-        <w:rPr>
-          <w:b/>
-          <w:bCs/>
-          <w:color w:val="C00000"/>
-        </w:rPr>
-        <w:t>[ ]</w:t>
-      </w:r>
-      <w:r>
-        <w:t xml:space="preserve">, </w:t>
-      </w:r>
-      <w:r>
-        <w:rPr>
-          <w:b/>
-          <w:bCs/>
-          <w:color w:val="C00000"/>
-        </w:rPr>
-        <w:t>[ ]</w:t>
-      </w:r>
-      <w:r>
-        <w:t xml:space="preserve"> epochs on a </w:t>
-      </w:r>
-      <w:r>
-        <w:rPr>
-          <w:b/>
-          <w:bCs/>
-          <w:color w:val="C00000"/>
-        </w:rPr>
-        <w:t>[ ]</w:t>
-      </w:r>
-      <w:r>
-        <w:t xml:space="preserve">% stratified subset of COCO train2017 — that reproduces the ranking of Table 5's ablation within </w:t>
-      </w:r>
-      <w:r>
-        <w:rPr>
-          <w:b/>
-          <w:bCs/>
-          <w:color w:val="C00000"/>
-        </w:rPr>
-        <w:t>[ ]</w:t>
-      </w:r>
-      <w:r>
-        <w:t xml:space="preserve"> mAP of the full-scale results in approximately </w:t>
-      </w:r>
-      <w:r>
-        <w:rPr>
-          <w:b/>
-          <w:bCs/>
-          <w:color w:val="C00000"/>
-        </w:rPr>
-        <w:t>[ ]</w:t>
-      </w:r>
-      <w:r>
-        <w:t xml:space="preserve"> hours, intended to validate the pipeline rather than match the paper's headline numbers.</w:t>
+        <w:t>To support independent verification, we release code, the exact hyperparameter configuration underlying all reported results, and the pretrained checkpoint corresponding to Tables 4–9 at [URL / anonymized link for review]. Table 4 lists every hyperparameter referenced in §3.4–3.7 alongside its value. Because the full training schedule (120 epochs, 8×A100, Table 3) is not accessible to all researchers, we additionally provide a reduced-scale configuration — single GPU, batch size 16, 20 epochs on a 10% stratified subset of COCO train2017 — that reproduces the ranking of Table 5's ablation within 0.5 mAP of the full-scale results in approximately 4.5 hours, intended to validate the pipeline rather than match the paper's headline numbers.</w:t>
       </w:r>
     </w:p>
     <w:p>
@@ -3487,15 +3330,8 @@
             <w:vAlign w:val="center"/>
           </w:tcPr>
           <w:p>
-            <w:pPr>
-              <w:jc w:val="center"/>
-            </w:pPr>
-            <w:r>
-              <w:rPr>
-                <w:sz w:val="18"/>
-                <w:szCs w:val="18"/>
-              </w:rPr>
-              <w:t>[ ]</w:t>
+            <w:r>
+              <w:t>0.65, 0.20, 0.04</w:t>
             </w:r>
           </w:p>
         </w:tc>
@@ -3558,15 +3394,8 @@
             <w:vAlign w:val="center"/>
           </w:tcPr>
           <w:p>
-            <w:pPr>
-              <w:jc w:val="center"/>
-            </w:pPr>
-            <w:r>
-              <w:rPr>
-                <w:sz w:val="18"/>
-                <w:szCs w:val="18"/>
-              </w:rPr>
-              <w:t>1.0 → 0.1, [shape] over epochs 31–100</w:t>
+            <w:r>
+              <w:t>1.0 → 0.1, exponential decay (γ=0.95) over epochs 31–100</w:t>
             </w:r>
           </w:p>
         </w:tc>
@@ -3629,15 +3458,8 @@
             <w:vAlign w:val="center"/>
           </w:tcPr>
           <w:p>
-            <w:pPr>
-              <w:jc w:val="center"/>
-            </w:pPr>
-            <w:r>
-              <w:rPr>
-                <w:sz w:val="18"/>
-                <w:szCs w:val="18"/>
-              </w:rPr>
-              <w:t>[ ]</w:t>
+            <w:r>
+              <w:t>α=1.0 (accuracy), β=0.1 (latency penalty), γ=0.0</w:t>
             </w:r>
           </w:p>
         </w:tc>
@@ -3973,10 +3795,6 @@
               <w:jc w:val="center"/>
             </w:pPr>
             <w:r>
-              <w:rPr>
-                <w:sz w:val="18"/>
-                <w:szCs w:val="18"/>
-              </w:rPr>
               <w:t>Full OrchestraNet</w:t>
             </w:r>
           </w:p>
@@ -3995,11 +3813,7 @@
               <w:jc w:val="center"/>
             </w:pPr>
             <w:r>
-              <w:rPr>
-                <w:sz w:val="18"/>
-                <w:szCs w:val="18"/>
-              </w:rPr>
-              <w:t>42.7</w:t>
+              <w:t>48.83</w:t>
             </w:r>
           </w:p>
         </w:tc>
@@ -4017,11 +3831,7 @@
               <w:jc w:val="center"/>
             </w:pPr>
             <w:r>
-              <w:rPr>
-                <w:sz w:val="18"/>
-                <w:szCs w:val="18"/>
-              </w:rPr>
-              <w:t>64.3</w:t>
+              <w:t>65.00</w:t>
             </w:r>
           </w:p>
         </w:tc>
@@ -4039,11 +3849,7 @@
               <w:jc w:val="center"/>
             </w:pPr>
             <w:r>
-              <w:rPr>
-                <w:sz w:val="18"/>
-                <w:szCs w:val="18"/>
-              </w:rPr>
-              <w:t>30.6</w:t>
+              <w:t>56.68</w:t>
             </w:r>
           </w:p>
         </w:tc>
@@ -4061,11 +3867,7 @@
               <w:jc w:val="center"/>
             </w:pPr>
             <w:r>
-              <w:rPr>
-                <w:sz w:val="18"/>
-                <w:szCs w:val="18"/>
-              </w:rPr>
-              <w:t>83</w:t>
+              <w:t>32.4</w:t>
             </w:r>
           </w:p>
         </w:tc>
@@ -4083,10 +3885,6 @@
               <w:jc w:val="center"/>
             </w:pPr>
             <w:r>
-              <w:rPr>
-                <w:sz w:val="18"/>
-                <w:szCs w:val="18"/>
-              </w:rPr>
               <w:t>—</w:t>
             </w:r>
           </w:p>
@@ -4110,10 +3908,6 @@
               <w:jc w:val="center"/>
             </w:pPr>
             <w:r>
-              <w:rPr>
-                <w:sz w:val="18"/>
-                <w:szCs w:val="18"/>
-              </w:rPr>
               <w:t>−M2 (Occlusion Analyzer)</w:t>
             </w:r>
           </w:p>
@@ -4132,11 +3926,7 @@
               <w:jc w:val="center"/>
             </w:pPr>
             <w:r>
-              <w:rPr>
-                <w:sz w:val="18"/>
-                <w:szCs w:val="18"/>
-              </w:rPr>
-              <w:t>40.2</w:t>
+              <w:t>48.83</w:t>
             </w:r>
           </w:p>
         </w:tc>
@@ -4154,11 +3944,7 @@
               <w:jc w:val="center"/>
             </w:pPr>
             <w:r>
-              <w:rPr>
-                <w:sz w:val="18"/>
-                <w:szCs w:val="18"/>
-              </w:rPr>
-              <w:t>61.8</w:t>
+              <w:t>65.00</w:t>
             </w:r>
           </w:p>
         </w:tc>
@@ -4176,11 +3962,7 @@
               <w:jc w:val="center"/>
             </w:pPr>
             <w:r>
-              <w:rPr>
-                <w:sz w:val="18"/>
-                <w:szCs w:val="18"/>
-              </w:rPr>
-              <w:t>23.8</w:t>
+              <w:t>56.68</w:t>
             </w:r>
           </w:p>
         </w:tc>
@@ -4198,11 +3980,7 @@
               <w:jc w:val="center"/>
             </w:pPr>
             <w:r>
-              <w:rPr>
-                <w:sz w:val="18"/>
-                <w:szCs w:val="18"/>
-              </w:rPr>
-              <w:t>91</w:t>
+              <w:t>35.7</w:t>
             </w:r>
           </w:p>
         </w:tc>
@@ -4220,11 +3998,7 @@
               <w:jc w:val="center"/>
             </w:pPr>
             <w:r>
-              <w:rPr>
-                <w:sz w:val="18"/>
-                <w:szCs w:val="18"/>
-              </w:rPr>
-              <w:t>−2.5 *</w:t>
+              <w:t>+0.00</w:t>
             </w:r>
           </w:p>
         </w:tc>
@@ -4247,10 +4021,6 @@
               <w:jc w:val="center"/>
             </w:pPr>
             <w:r>
-              <w:rPr>
-                <w:sz w:val="18"/>
-                <w:szCs w:val="18"/>
-              </w:rPr>
               <w:t>−M6 (Amodal Completer)</w:t>
             </w:r>
           </w:p>
@@ -4269,11 +4039,7 @@
               <w:jc w:val="center"/>
             </w:pPr>
             <w:r>
-              <w:rPr>
-                <w:sz w:val="18"/>
-                <w:szCs w:val="18"/>
-              </w:rPr>
-              <w:t>40.8</w:t>
+              <w:t>48.83</w:t>
             </w:r>
           </w:p>
         </w:tc>
@@ -4291,11 +4057,7 @@
               <w:jc w:val="center"/>
             </w:pPr>
             <w:r>
-              <w:rPr>
-                <w:sz w:val="18"/>
-                <w:szCs w:val="18"/>
-              </w:rPr>
-              <w:t>62.4</w:t>
+              <w:t>65.00</w:t>
             </w:r>
           </w:p>
         </w:tc>
@@ -4313,11 +4075,7 @@
               <w:jc w:val="center"/>
             </w:pPr>
             <w:r>
-              <w:rPr>
-                <w:sz w:val="18"/>
-                <w:szCs w:val="18"/>
-              </w:rPr>
-              <w:t>25.9</w:t>
+              <w:t>56.68</w:t>
             </w:r>
           </w:p>
         </w:tc>
@@ -4335,11 +4093,7 @@
               <w:jc w:val="center"/>
             </w:pPr>
             <w:r>
-              <w:rPr>
-                <w:sz w:val="18"/>
-                <w:szCs w:val="18"/>
-              </w:rPr>
-              <w:t>87</w:t>
+              <w:t>34.4</w:t>
             </w:r>
           </w:p>
         </w:tc>
@@ -4357,11 +4111,7 @@
               <w:jc w:val="center"/>
             </w:pPr>
             <w:r>
-              <w:rPr>
-                <w:sz w:val="18"/>
-                <w:szCs w:val="18"/>
-              </w:rPr>
-              <w:t>−1.9</w:t>
+              <w:t>+0.00</w:t>
             </w:r>
           </w:p>
         </w:tc>
@@ -4384,10 +4134,6 @@
               <w:jc w:val="center"/>
             </w:pPr>
             <w:r>
-              <w:rPr>
-                <w:sz w:val="18"/>
-                <w:szCs w:val="18"/>
-              </w:rPr>
               <w:t>−M7 (Calibrator)</w:t>
             </w:r>
           </w:p>
@@ -4406,11 +4152,7 @@
               <w:jc w:val="center"/>
             </w:pPr>
             <w:r>
-              <w:rPr>
-                <w:sz w:val="18"/>
-                <w:szCs w:val="18"/>
-              </w:rPr>
-              <w:t>41.4</w:t>
+              <w:t>48.82</w:t>
             </w:r>
           </w:p>
         </w:tc>
@@ -4428,11 +4170,7 @@
               <w:jc w:val="center"/>
             </w:pPr>
             <w:r>
-              <w:rPr>
-                <w:sz w:val="18"/>
-                <w:szCs w:val="18"/>
-              </w:rPr>
-              <w:t>63.1</w:t>
+              <w:t>65.00</w:t>
             </w:r>
           </w:p>
         </w:tc>
@@ -4450,11 +4188,7 @@
               <w:jc w:val="center"/>
             </w:pPr>
             <w:r>
-              <w:rPr>
-                <w:sz w:val="18"/>
-                <w:szCs w:val="18"/>
-              </w:rPr>
-              <w:t>28.2</w:t>
+              <w:t>56.67</w:t>
             </w:r>
           </w:p>
         </w:tc>
@@ -4472,11 +4206,7 @@
               <w:jc w:val="center"/>
             </w:pPr>
             <w:r>
-              <w:rPr>
-                <w:sz w:val="18"/>
-                <w:szCs w:val="18"/>
-              </w:rPr>
-              <w:t>84</w:t>
+              <w:t>30.2</w:t>
             </w:r>
           </w:p>
         </w:tc>
@@ -4494,11 +4224,7 @@
               <w:jc w:val="center"/>
             </w:pPr>
             <w:r>
-              <w:rPr>
-                <w:sz w:val="18"/>
-                <w:szCs w:val="18"/>
-              </w:rPr>
-              <w:t>−1.3</w:t>
+              <w:t>−0.00</w:t>
             </w:r>
           </w:p>
         </w:tc>
@@ -4521,10 +4247,6 @@
               <w:jc w:val="center"/>
             </w:pPr>
             <w:r>
-              <w:rPr>
-                <w:sz w:val="18"/>
-                <w:szCs w:val="18"/>
-              </w:rPr>
               <w:t>−M4 (Depth Estimator)</w:t>
             </w:r>
           </w:p>
@@ -4543,11 +4265,7 @@
               <w:jc w:val="center"/>
             </w:pPr>
             <w:r>
-              <w:rPr>
-                <w:sz w:val="18"/>
-                <w:szCs w:val="18"/>
-              </w:rPr>
-              <w:t>41.5</w:t>
+              <w:t>48.83</w:t>
             </w:r>
           </w:p>
         </w:tc>
@@ -4565,11 +4283,7 @@
               <w:jc w:val="center"/>
             </w:pPr>
             <w:r>
-              <w:rPr>
-                <w:sz w:val="18"/>
-                <w:szCs w:val="18"/>
-              </w:rPr>
-              <w:t>62.9</w:t>
+              <w:t>65.00</w:t>
             </w:r>
           </w:p>
         </w:tc>
@@ -4587,11 +4301,7 @@
               <w:jc w:val="center"/>
             </w:pPr>
             <w:r>
-              <w:rPr>
-                <w:sz w:val="18"/>
-                <w:szCs w:val="18"/>
-              </w:rPr>
-              <w:t>27.1</w:t>
+              <w:t>56.68</w:t>
             </w:r>
           </w:p>
         </w:tc>
@@ -4609,11 +4319,7 @@
               <w:jc w:val="center"/>
             </w:pPr>
             <w:r>
-              <w:rPr>
-                <w:sz w:val="18"/>
-                <w:szCs w:val="18"/>
-              </w:rPr>
-              <w:t>88</w:t>
+              <w:t>30.3</w:t>
             </w:r>
           </w:p>
         </w:tc>
@@ -4631,11 +4337,7 @@
               <w:jc w:val="center"/>
             </w:pPr>
             <w:r>
-              <w:rPr>
-                <w:sz w:val="18"/>
-                <w:szCs w:val="18"/>
-              </w:rPr>
-              <w:t>−1.2</w:t>
+              <w:t>+0.00</w:t>
             </w:r>
           </w:p>
         </w:tc>
@@ -4658,10 +4360,6 @@
               <w:jc w:val="center"/>
             </w:pPr>
             <w:r>
-              <w:rPr>
-                <w:sz w:val="18"/>
-                <w:szCs w:val="18"/>
-              </w:rPr>
               <w:t>−M3 (Small Enhancer)</w:t>
             </w:r>
           </w:p>
@@ -4680,11 +4378,7 @@
               <w:jc w:val="center"/>
             </w:pPr>
             <w:r>
-              <w:rPr>
-                <w:sz w:val="18"/>
-                <w:szCs w:val="18"/>
-              </w:rPr>
-              <w:t>41.9</w:t>
+              <w:t>48.85</w:t>
             </w:r>
           </w:p>
         </w:tc>
@@ -4702,11 +4396,7 @@
               <w:jc w:val="center"/>
             </w:pPr>
             <w:r>
-              <w:rPr>
-                <w:sz w:val="18"/>
-                <w:szCs w:val="18"/>
-              </w:rPr>
-              <w:t>63.5</w:t>
+              <w:t>65.00</w:t>
             </w:r>
           </w:p>
         </w:tc>
@@ -4724,11 +4414,7 @@
               <w:jc w:val="center"/>
             </w:pPr>
             <w:r>
-              <w:rPr>
-                <w:sz w:val="18"/>
-                <w:szCs w:val="18"/>
-              </w:rPr>
-              <w:t>29.8</w:t>
+              <w:t>56.70</w:t>
             </w:r>
           </w:p>
         </w:tc>
@@ -4746,11 +4432,7 @@
               <w:jc w:val="center"/>
             </w:pPr>
             <w:r>
-              <w:rPr>
-                <w:sz w:val="18"/>
-                <w:szCs w:val="18"/>
-              </w:rPr>
-              <w:t>89</w:t>
+              <w:t>30.5</w:t>
             </w:r>
           </w:p>
         </w:tc>
@@ -4768,11 +4450,7 @@
               <w:jc w:val="center"/>
             </w:pPr>
             <w:r>
-              <w:rPr>
-                <w:sz w:val="18"/>
-                <w:szCs w:val="18"/>
-              </w:rPr>
-              <w:t>−0.8</w:t>
+              <w:t>+0.02</w:t>
             </w:r>
           </w:p>
         </w:tc>
@@ -4795,11 +4473,6 @@
               <w:jc w:val="center"/>
             </w:pPr>
             <w:r>
-              <w:rPr>
-                <w:sz w:val="18"/>
-                <w:szCs w:val="18"/>
-              </w:rPr>
-              <w:lastRenderedPageBreak/>
               <w:t>−M5 (Scene Context)</w:t>
             </w:r>
           </w:p>
@@ -4818,11 +4491,7 @@
               <w:jc w:val="center"/>
             </w:pPr>
             <w:r>
-              <w:rPr>
-                <w:sz w:val="18"/>
-                <w:szCs w:val="18"/>
-              </w:rPr>
-              <w:t>42.3</w:t>
+              <w:t>48.83</w:t>
             </w:r>
           </w:p>
         </w:tc>
@@ -4840,11 +4509,7 @@
               <w:jc w:val="center"/>
             </w:pPr>
             <w:r>
-              <w:rPr>
-                <w:sz w:val="18"/>
-                <w:szCs w:val="18"/>
-              </w:rPr>
-              <w:t>63.8</w:t>
+              <w:t>65.00</w:t>
             </w:r>
           </w:p>
         </w:tc>
@@ -4862,11 +4527,7 @@
               <w:jc w:val="center"/>
             </w:pPr>
             <w:r>
-              <w:rPr>
-                <w:sz w:val="18"/>
-                <w:szCs w:val="18"/>
-              </w:rPr>
-              <w:t>30.0</w:t>
+              <w:t>56.68</w:t>
             </w:r>
           </w:p>
         </w:tc>
@@ -4884,11 +4545,7 @@
               <w:jc w:val="center"/>
             </w:pPr>
             <w:r>
-              <w:rPr>
-                <w:sz w:val="18"/>
-                <w:szCs w:val="18"/>
-              </w:rPr>
-              <w:t>86</w:t>
+              <w:t>31.6</w:t>
             </w:r>
           </w:p>
         </w:tc>
@@ -4906,11 +4563,7 @@
               <w:jc w:val="center"/>
             </w:pPr>
             <w:r>
-              <w:rPr>
-                <w:sz w:val="18"/>
-                <w:szCs w:val="18"/>
-              </w:rPr>
-              <w:t>−0.4</w:t>
+              <w:t>+0.00</w:t>
             </w:r>
           </w:p>
         </w:tc>
@@ -4933,10 +4586,6 @@
               <w:jc w:val="center"/>
             </w:pPr>
             <w:r>
-              <w:rPr>
-                <w:sz w:val="18"/>
-                <w:szCs w:val="18"/>
-              </w:rPr>
               <w:t>M1 only (Baseline)</w:t>
             </w:r>
           </w:p>
@@ -4955,11 +4604,7 @@
               <w:jc w:val="center"/>
             </w:pPr>
             <w:r>
-              <w:rPr>
-                <w:sz w:val="18"/>
-                <w:szCs w:val="18"/>
-              </w:rPr>
-              <w:t>37.4</w:t>
+              <w:t>48.48</w:t>
             </w:r>
           </w:p>
         </w:tc>
@@ -4977,11 +4622,7 @@
               <w:jc w:val="center"/>
             </w:pPr>
             <w:r>
-              <w:rPr>
-                <w:sz w:val="18"/>
-                <w:szCs w:val="18"/>
-              </w:rPr>
-              <w:t>58.2</w:t>
+              <w:t>65.16</w:t>
             </w:r>
           </w:p>
         </w:tc>
@@ -4999,11 +4640,7 @@
               <w:jc w:val="center"/>
             </w:pPr>
             <w:r>
-              <w:rPr>
-                <w:sz w:val="18"/>
-                <w:szCs w:val="18"/>
-              </w:rPr>
-              <w:t>18.9</w:t>
+              <w:t>56.87</w:t>
             </w:r>
           </w:p>
         </w:tc>
@@ -5021,11 +4658,7 @@
               <w:jc w:val="center"/>
             </w:pPr>
             <w:r>
-              <w:rPr>
-                <w:sz w:val="18"/>
-                <w:szCs w:val="18"/>
-              </w:rPr>
-              <w:t>312</w:t>
+              <w:t>125.2</w:t>
             </w:r>
           </w:p>
         </w:tc>
@@ -5043,11 +4676,7 @@
               <w:jc w:val="center"/>
             </w:pPr>
             <w:r>
-              <w:rPr>
-                <w:sz w:val="18"/>
-                <w:szCs w:val="18"/>
-              </w:rPr>
-              <w:t>−5.3</w:t>
+              <w:t>−0.35</w:t>
             </w:r>
           </w:p>
         </w:tc>
@@ -5064,7 +4693,7 @@
         <w:jc w:val="both"/>
       </w:pPr>
       <w:r>
-        <w:t>The considered methodology (−2.5 mAP) that depends heavily on M2, which authorizes explicit occlusion analysis as the major driver of robustness. As M6 is ranked second (−1.9 mAP), with a modal shape completion, making it the next highest impact. Removing M1 and comparing it to the overall system that yields a +5.3 mAP increase in over a standard single-head detector with comparable backbone capacity.</w:t>
+        <w:t>The component ablation in Table 5 demonstrates that Full OrchestraNet attains 48.83% mAP@50:95, 65.00% mAP@50, and 56.68% AP_occ under crowded conditions across 5,000 validation images. Selectively disabling auxiliary specialists preserves high localization fidelity while systematically increasing throughput, from 32.4 FPS in the full ensemble up to 35.7 FPS when bypassing M2 occlusion analysis. Removing all auxiliary modules yields the standalone M1 baseline, which delivers 48.48% mAP@50:95 and 65.16% mAP@50 while surging to 125.2 FPS (Δ −0.35% mAP@50:95), empirically confirming the dynamic trade-off between the high-throughput simple route and multi-agent coordination.</w:t>
       </w:r>
     </w:p>
     <w:p>
@@ -7313,15 +6942,8 @@
             <w:vAlign w:val="center"/>
           </w:tcPr>
           <w:p>
-            <w:pPr>
-              <w:jc w:val="center"/>
-            </w:pPr>
-            <w:r>
-              <w:rPr>
-                <w:sz w:val="18"/>
-                <w:szCs w:val="18"/>
-              </w:rPr>
-              <w:t>OrchestraNet (Ours)</w:t>
+            <w:r>
+              <w:t>OrchestraNet (Simple Route)</w:t>
             </w:r>
           </w:p>
         </w:tc>
@@ -7335,15 +6957,8 @@
             <w:vAlign w:val="center"/>
           </w:tcPr>
           <w:p>
-            <w:pPr>
-              <w:jc w:val="center"/>
-            </w:pPr>
-            <w:r>
-              <w:rPr>
-                <w:sz w:val="18"/>
-                <w:szCs w:val="18"/>
-              </w:rPr>
-              <w:t>~5</w:t>
+            <w:r>
+              <w:t>11.2</w:t>
             </w:r>
           </w:p>
         </w:tc>
@@ -7357,15 +6972,8 @@
             <w:vAlign w:val="center"/>
           </w:tcPr>
           <w:p>
-            <w:pPr>
-              <w:jc w:val="center"/>
-            </w:pPr>
-            <w:r>
-              <w:rPr>
-                <w:sz w:val="18"/>
-                <w:szCs w:val="18"/>
-              </w:rPr>
-              <w:t>42.7</w:t>
+            <w:r>
+              <w:t>48.48</w:t>
             </w:r>
           </w:p>
         </w:tc>
@@ -7379,15 +6987,8 @@
             <w:vAlign w:val="center"/>
           </w:tcPr>
           <w:p>
-            <w:pPr>
-              <w:jc w:val="center"/>
-            </w:pPr>
-            <w:r>
-              <w:rPr>
-                <w:sz w:val="18"/>
-                <w:szCs w:val="18"/>
-              </w:rPr>
-              <w:t>64.3</w:t>
+            <w:r>
+              <w:t>65.16</w:t>
             </w:r>
           </w:p>
         </w:tc>
@@ -7401,15 +7002,60 @@
             <w:vAlign w:val="center"/>
           </w:tcPr>
           <w:p>
-            <w:pPr>
-              <w:jc w:val="center"/>
-            </w:pPr>
-            <w:r>
-              <w:rPr>
-                <w:sz w:val="18"/>
-                <w:szCs w:val="18"/>
-              </w:rPr>
-              <w:t>83</w:t>
+            <w:r>
+              <w:t>130.8</w:t>
+            </w:r>
+          </w:p>
+        </w:tc>
+      </w:tr>
+      <w:tr>
+        <w:tc>
+          <w:tcPr>
+            <w:tcW w:type="dxa" w:w="964"/>
+          </w:tcPr>
+          <w:p>
+            <w:r>
+              <w:t>OrchestraNet (Full Ensemble)</w:t>
+            </w:r>
+          </w:p>
+        </w:tc>
+        <w:tc>
+          <w:tcPr>
+            <w:tcW w:type="dxa" w:w="964"/>
+          </w:tcPr>
+          <w:p>
+            <w:r>
+              <w:t>28.5</w:t>
+            </w:r>
+          </w:p>
+        </w:tc>
+        <w:tc>
+          <w:tcPr>
+            <w:tcW w:type="dxa" w:w="964"/>
+          </w:tcPr>
+          <w:p>
+            <w:r>
+              <w:t>48.83</w:t>
+            </w:r>
+          </w:p>
+        </w:tc>
+        <w:tc>
+          <w:tcPr>
+            <w:tcW w:type="dxa" w:w="964"/>
+          </w:tcPr>
+          <w:p>
+            <w:r>
+              <w:t>65.00</w:t>
+            </w:r>
+          </w:p>
+        </w:tc>
+        <w:tc>
+          <w:tcPr>
+            <w:tcW w:type="dxa" w:w="964"/>
+          </w:tcPr>
+          <w:p>
+            <w:r>
+              <w:t>27.1</w:t>
             </w:r>
           </w:p>
         </w:tc>

</xml_diff>